<commit_message>
Versao final para deploy
</commit_message>
<xml_diff>
--- a/docs/Manual-do-Usuario.docx
+++ b/docs/Manual-do-Usuario.docx
@@ -15,7 +15,7 @@
           <w:sz w:val="56"/>
           <w:szCs w:val="56"/>
         </w:rPr>
-        <w:t xml:space="preserve">🎯 Controle de Carteira</w:t>
+        <w:t xml:space="preserve">✨ Beleza Boost</w:t>
       </w:r>
     </w:p>
     <w:p>
@@ -28,7 +28,7 @@
           <w:sz w:val="34"/>
           <w:szCs w:val="34"/>
         </w:rPr>
-        <w:t xml:space="preserve">Manual do Usuário</w:t>
+        <w:t xml:space="preserve">Controle de Clientes — Manual do Usuário</w:t>
       </w:r>
     </w:p>
     <w:p>
@@ -44,7 +44,7 @@
           <w:sz w:val="22"/>
           <w:szCs w:val="22"/>
         </w:rPr>
-        <w:t xml:space="preserve">Sistema de controle de clientes da carteira — Agência de Tráfego Pago</w:t>
+        <w:t xml:space="preserve">Sistema de controle de clientes da carteira — Beleza Boost</w:t>
       </w:r>
     </w:p>
     <w:p>
@@ -73,7 +73,7 @@
           <w:b/>
           <w:bCs/>
         </w:rPr>
-        <w:t xml:space="preserve">Controle de Carteira</w:t>
+        <w:t xml:space="preserve">Controle de Clientes</w:t>
       </w:r>
       <w:r>
         <w:t xml:space="preserve">, o sistema que substitui a planilha "Clientes e Responsáveis". Aqui você aprende a entrar no sistema, consultar seus clientes, entender os alertas e, se for administrador, manter tudo atualizado.</w:t>

</xml_diff>

<commit_message>
Adiciona servicos contratados (Nao tem) e artes semanais no cadastro de cliente
</commit_message>
<xml_diff>
--- a/docs/Manual-do-Usuario.docx
+++ b/docs/Manual-do-Usuario.docx
@@ -420,7 +420,49 @@
         <w:rPr>
           <w:color w:val="1A1A1A"/>
         </w:rPr>
-        <w:t xml:space="preserve"> ou em qualquer linha da tabela. No formulário você define nome (padrão: marca + unidade, ex.: "Fast Escova Aclimação"), marca, status, o responsável de cada função (Estrategista de Atendimento, Estrategista de Planejamento, Copywriter, Apoio, Consultor/Gerente, Social Media e Edição de Vídeos — use "EQUIPE PRÓPRIA" quando o próprio cliente cuida), as datas de inauguração, saída, aniversário da unidade e entrada na carteira, o acesso de tráfego e observações. Os nomes dos dropdowns vêm do cadastro de equipe em Configurações. Também dá pra chegar direto num cliente clicando na linha dele na tela </w:t>
+        <w:t xml:space="preserve"> ou em qualquer linha da tabela. No formulário você define nome (padrão: marca + unidade, ex.: "Fast Escova Aclimação"), marca, status, o responsável de cada função (Estrategista de Atendimento, Estrategista de Planejamento, Copywriter, Apoio, Consultor/Gerente, Social Media e Edição de Vídeos), as datas de inauguração, saída, aniversário da unidade e entrada na carteira, quantas </w:t>
+      </w:r>
+      <w:r>
+        <w:rPr>
+          <w:b/>
+          <w:bCs/>
+          <w:color w:val="1A1A1A"/>
+        </w:rPr>
+        <w:t xml:space="preserve">artes semanais</w:t>
+      </w:r>
+      <w:r>
+        <w:rPr>
+          <w:color w:val="1A1A1A"/>
+        </w:rPr>
+        <w:t xml:space="preserve"> o contrato inclui, o acesso de tráfego e observações. Nos campos de Apoio, Consultor, Social Media e Edição de Vídeos tem duas opções especiais: </w:t>
+      </w:r>
+      <w:r>
+        <w:rPr>
+          <w:b/>
+          <w:bCs/>
+          <w:color w:val="1A1A1A"/>
+        </w:rPr>
+        <w:t xml:space="preserve">"EQUIPE PRÓPRIA"</w:t>
+      </w:r>
+      <w:r>
+        <w:rPr>
+          <w:color w:val="1A1A1A"/>
+        </w:rPr>
+        <w:t xml:space="preserve"> quando é o time do próprio cliente que cuida, e </w:t>
+      </w:r>
+      <w:r>
+        <w:rPr>
+          <w:b/>
+          <w:bCs/>
+          <w:color w:val="1A1A1A"/>
+        </w:rPr>
+        <w:t xml:space="preserve">"NÃO TEM"</w:t>
+      </w:r>
+      <w:r>
+        <w:rPr>
+          <w:color w:val="1A1A1A"/>
+        </w:rPr>
+        <w:t xml:space="preserve"> quando esse serviço simplesmente não faz parte do contrato — nos dois casos não vira pendência no dashboard. Os nomes dos dropdowns vêm do cadastro de equipe em Configurações. Também dá pra chegar direto num cliente clicando na linha dele na tela </w:t>
       </w:r>
       <w:r>
         <w:rPr>
@@ -435,6 +477,25 @@
           <w:color w:val="1A1A1A"/>
         </w:rPr>
         <w:t xml:space="preserve">.</w:t>
+      </w:r>
+    </w:p>
+    <w:p>
+      <w:pPr>
+        <w:spacing w:after="180"/>
+      </w:pPr>
+      <w:r>
+        <w:rPr>
+          <w:b/>
+          <w:bCs/>
+          <w:color w:val="1A1A1A"/>
+        </w:rPr>
+        <w:t xml:space="preserve">Coluna Serviços</w:t>
+      </w:r>
+      <w:r>
+        <w:rPr>
+          <w:color w:val="1A1A1A"/>
+        </w:rPr>
+        <w:t xml:space="preserve">: mostra de relance o que a agência faz por aquele cliente — 📱 Social Media e 🎬 Edição de Vídeo aparecem coloridos quando é a agência que executa, com 🏠 quando é a equipe própria do cliente, e 🎨 com a quantidade de artes semanais contratadas. Serviço marcado como "NÃO TEM" simplesmente não aparece.</w:t>
       </w:r>
     </w:p>
     <w:p>
@@ -1206,6 +1267,79 @@
           <w:color w:val="1A1A1A"/>
         </w:rPr>
         <w:t xml:space="preserve">: nos campos de senha do login e das Configurações.</w:t>
+      </w:r>
+    </w:p>
+    <w:p>
+      <w:pPr>
+        <w:pStyle w:val="Heading1"/>
+        <w:spacing w:after="160" w:before="340"/>
+      </w:pPr>
+      <w:r>
+        <w:rPr>
+          <w:b/>
+          <w:bCs/>
+          <w:color w:val="C4973B"/>
+          <w:sz w:val="28"/>
+          <w:szCs w:val="28"/>
+        </w:rPr>
+        <w:t xml:space="preserve">Novidades da versão 4</w:t>
+      </w:r>
+    </w:p>
+    <w:p>
+      <w:pPr>
+        <w:spacing w:after="180"/>
+      </w:pPr>
+      <w:r>
+        <w:rPr>
+          <w:b/>
+          <w:bCs/>
+          <w:color w:val="1A1A1A"/>
+        </w:rPr>
+        <w:t xml:space="preserve">Serviços contratados</w:t>
+      </w:r>
+      <w:r>
+        <w:rPr>
+          <w:color w:val="1A1A1A"/>
+        </w:rPr>
+        <w:t xml:space="preserve">: os campos de Apoio, Consultor, Social Media e Edição de Vídeos ganharam a opção "NÃO TEM", além da já existente "EQUIPE PRÓPRIA" — assim dá pra registrar direito quando um serviço não é feito pela agência, sem gerar pendência à toa.</w:t>
+      </w:r>
+    </w:p>
+    <w:p>
+      <w:pPr>
+        <w:spacing w:after="180"/>
+      </w:pPr>
+      <w:r>
+        <w:rPr>
+          <w:b/>
+          <w:bCs/>
+          <w:color w:val="1A1A1A"/>
+        </w:rPr>
+        <w:t xml:space="preserve">Artes semanais</w:t>
+      </w:r>
+      <w:r>
+        <w:rPr>
+          <w:color w:val="1A1A1A"/>
+        </w:rPr>
+        <w:t xml:space="preserve">: novo campo no cadastro do cliente pra guardar quantas artes por semana o contrato inclui.</w:t>
+      </w:r>
+    </w:p>
+    <w:p>
+      <w:pPr>
+        <w:spacing w:after="180"/>
+      </w:pPr>
+      <w:r>
+        <w:rPr>
+          <w:b/>
+          <w:bCs/>
+          <w:color w:val="1A1A1A"/>
+        </w:rPr>
+        <w:t xml:space="preserve">Coluna Serviços em Clientes</w:t>
+      </w:r>
+      <w:r>
+        <w:rPr>
+          <w:color w:val="1A1A1A"/>
+        </w:rPr>
+        <w:t xml:space="preserve">: etiquetas rápidas mostrando o que a agência faz por cada cliente, direto na listagem.</w:t>
       </w:r>
     </w:p>
     <w:sectPr>

</xml_diff>

<commit_message>
Atualiza documentacao com a migracao pro Supabase
</commit_message>
<xml_diff>
--- a/docs/Manual-do-Usuario.docx
+++ b/docs/Manual-do-Usuario.docx
@@ -1340,6 +1340,55 @@
           <w:color w:val="1A1A1A"/>
         </w:rPr>
         <w:t xml:space="preserve">: etiquetas rápidas mostrando o que a agência faz por cada cliente, direto na listagem.</w:t>
+      </w:r>
+    </w:p>
+    <w:p>
+      <w:pPr>
+        <w:pStyle w:val="Heading1"/>
+        <w:spacing w:after="160" w:before="340"/>
+      </w:pPr>
+      <w:r>
+        <w:rPr>
+          <w:b/>
+          <w:bCs/>
+          <w:color w:val="C4973B"/>
+          <w:sz w:val="28"/>
+          <w:szCs w:val="28"/>
+        </w:rPr>
+        <w:t xml:space="preserve">Novidades da versão 5</w:t>
+      </w:r>
+    </w:p>
+    <w:p>
+      <w:pPr>
+        <w:spacing w:after="180"/>
+      </w:pPr>
+      <w:r>
+        <w:rPr>
+          <w:b/>
+          <w:bCs/>
+          <w:color w:val="1A1A1A"/>
+        </w:rPr>
+        <w:t xml:space="preserve">Dados migrados pro Supabase</w:t>
+      </w:r>
+      <w:r>
+        <w:rPr>
+          <w:color w:val="1A1A1A"/>
+        </w:rPr>
+        <w:t xml:space="preserve">: os dados do sistema (clientes, faturamento, equipe, contas de acesso) agora ficam guardados num banco de dados de verdade (Postgres, hospedado no Supabase), com </w:t>
+      </w:r>
+      <w:r>
+        <w:rPr>
+          <w:b/>
+          <w:bCs/>
+          <w:color w:val="1A1A1A"/>
+        </w:rPr>
+        <w:t xml:space="preserve">backup automático</w:t>
+      </w:r>
+      <w:r>
+        <w:rPr>
+          <w:color w:val="1A1A1A"/>
+        </w:rPr>
+        <w:t xml:space="preserve">. Antes ficavam em arquivos dentro do Railway, sem backup — se o servidor tivesse algum problema sério, havia risco de perder tudo. Pra quem usa o sistema no dia a dia isso não muda nada visualmente; é só uma proteção a mais nos bastidores.</w:t>
       </w:r>
     </w:p>
     <w:sectPr>

</xml_diff>

<commit_message>
Adiciona papel Comercial (cadastra e edita clientes)
</commit_message>
<xml_diff>
--- a/docs/Manual-do-Usuario.docx
+++ b/docs/Manual-do-Usuario.docx
@@ -161,6 +161,25 @@
           <w:bCs/>
           <w:color w:val="1A1A1A"/>
         </w:rPr>
+        <w:t xml:space="preserve">🧑‍💼 Comercial</w:t>
+      </w:r>
+      <w:r>
+        <w:rPr>
+          <w:color w:val="1A1A1A"/>
+        </w:rPr>
+        <w:t xml:space="preserve"> vê a carteira completa (igual ao administrador) e pode cadastrar e editar clientes — pensado pro time comercial fechar um cliente novo e já lançar no sistema. Não exclui cliente e não tem acesso a equipe, contas de acesso, faturamento nem relatórios.</w:t>
+      </w:r>
+    </w:p>
+    <w:p>
+      <w:pPr>
+        <w:spacing w:after="180"/>
+      </w:pPr>
+      <w:r>
+        <w:rPr>
+          <w:b/>
+          <w:bCs/>
+          <w:color w:val="1A1A1A"/>
+        </w:rPr>
         <w:t xml:space="preserve">📈 Gestor de Tráfego</w:t>
       </w:r>
       <w:r>
@@ -857,7 +876,7 @@
         <w:rPr>
           <w:color w:val="1A1A1A"/>
         </w:rPr>
-        <w:t xml:space="preserve"> (define quais clientes ele enxerga) e, se for o caso, marque a função "Estrategista de Atendimento" pra liberar o acesso ao Faturamento. Para trocar uma senha, edite o usuário e digite a nova senha (deixe em branco para manter a atual). Você não consegue excluir a própria conta.</w:t>
+        <w:t xml:space="preserve"> (define quais clientes ele enxerga) e, se for o caso, marque a função "Estrategista de Atendimento" pra liberar o acesso ao Faturamento. Para dar acesso ao time comercial, escolha o papel "🧑‍💼 Comercial" — não precisa vincular a nenhum membro da equipe, já que ele vê a carteira inteira. Para trocar uma senha, edite o usuário e digite a nova senha (deixe em branco para manter a atual). Você não consegue excluir a própria conta.</w:t>
       </w:r>
     </w:p>
     <w:p>
@@ -1389,6 +1408,41 @@
           <w:color w:val="1A1A1A"/>
         </w:rPr>
         <w:t xml:space="preserve">. Antes ficavam em arquivos dentro do Railway, sem backup — se o servidor tivesse algum problema sério, havia risco de perder tudo. Pra quem usa o sistema no dia a dia isso não muda nada visualmente; é só uma proteção a mais nos bastidores.</w:t>
+      </w:r>
+    </w:p>
+    <w:p>
+      <w:pPr>
+        <w:pStyle w:val="Heading1"/>
+        <w:spacing w:after="160" w:before="340"/>
+      </w:pPr>
+      <w:r>
+        <w:rPr>
+          <w:b/>
+          <w:bCs/>
+          <w:color w:val="C4973B"/>
+          <w:sz w:val="28"/>
+          <w:szCs w:val="28"/>
+        </w:rPr>
+        <w:t xml:space="preserve">Novidades da versão 6</w:t>
+      </w:r>
+    </w:p>
+    <w:p>
+      <w:pPr>
+        <w:spacing w:after="180"/>
+      </w:pPr>
+      <w:r>
+        <w:rPr>
+          <w:b/>
+          <w:bCs/>
+          <w:color w:val="1A1A1A"/>
+        </w:rPr>
+        <w:t xml:space="preserve">Novo papel: 🧑‍💼 Comercial</w:t>
+      </w:r>
+      <w:r>
+        <w:rPr>
+          <w:color w:val="1A1A1A"/>
+        </w:rPr>
+        <w:t xml:space="preserve">: agora dá pra dar acesso ao time comercial pra cadastrar cliente novo direto no sistema, sem precisar do administrador. Comercial vê a carteira inteira e pode cadastrar e editar clientes, mas não exclui nenhum e não tem acesso a equipe, contas de acesso, faturamento ou relatórios — isso continua só com o administrador.</w:t>
       </w:r>
     </w:p>
     <w:sectPr>

</xml_diff>

<commit_message>
Renomeia acesso de trafego pra Gestor de Trafego
</commit_message>
<xml_diff>
--- a/docs/Manual-do-Usuario.docx
+++ b/docs/Manual-do-Usuario.docx
@@ -180,7 +180,26 @@
           <w:bCs/>
           <w:color w:val="1A1A1A"/>
         </w:rPr>
-        <w:t xml:space="preserve">📈 Gestor de Tráfego</w:t>
+        <w:t xml:space="preserve">🚦 Gestor de Tráfego (acesso à carteira inteira)</w:t>
+      </w:r>
+      <w:r>
+        <w:rPr>
+          <w:color w:val="1A1A1A"/>
+        </w:rPr>
+        <w:t xml:space="preserve"> vê a carteira completa (igual ao administrador), mas só pode alterar o campo Acesso de Tráfego (Sim/Não) do cadastro de cada cliente — todo o resto do cadastro fica travado na tela (e o sistema também bloqueia por trás, então nem forçando dá pra mudar mais nada). Não cadastra cliente novo, não exclui, e não tem acesso a equipe, contas de acesso, faturamento nem relatórios. Atenção: existe outro tipo de acesso com nome parecido logo abaixo (o gestor individual) — são coisas diferentes, não confunda na hora de criar a conta em Configurações.</w:t>
+      </w:r>
+    </w:p>
+    <w:p>
+      <w:pPr>
+        <w:spacing w:after="180"/>
+      </w:pPr>
+      <w:r>
+        <w:rPr>
+          <w:b/>
+          <w:bCs/>
+          <w:color w:val="1A1A1A"/>
+        </w:rPr>
+        <w:t xml:space="preserve">📈 Gestor de Tráfego (individual)</w:t>
       </w:r>
       <w:r>
         <w:rPr>
@@ -327,7 +346,21 @@
         <w:rPr>
           <w:color w:val="1A1A1A"/>
         </w:rPr>
-        <w:t xml:space="preserve"> — clientes com alguma função sem responsável definido (inclui os que estavam "A confirmar" na planilha) ou sem acesso de tráfego liberado. A meta é manter essa lista zerada.</w:t>
+        <w:t xml:space="preserve"> — clientes com alguma função sem responsável definido (inclui os que estavam "A confirmar" na planilha). 🔒 </w:t>
+      </w:r>
+      <w:r>
+        <w:rPr>
+          <w:b/>
+          <w:bCs/>
+          <w:color w:val="1A1A1A"/>
+        </w:rPr>
+        <w:t xml:space="preserve">Sem acesso de tráfego</w:t>
+      </w:r>
+      <w:r>
+        <w:rPr>
+          <w:color w:val="1A1A1A"/>
+        </w:rPr>
+        <w:t xml:space="preserve"> — clientes com o campo Acesso de Tráfego marcado como "Não". É esse alerta que o acesso de Gestor de Tráfego (o de carteira inteira) acompanha no dia a dia. A meta é manter essas listas zeradas.</w:t>
       </w:r>
     </w:p>
     <w:p>
@@ -419,7 +452,7 @@
           <w:bCs/>
           <w:color w:val="1A1A1A"/>
         </w:rPr>
-        <w:t xml:space="preserve">Cadastrar ou editar (só admin)</w:t>
+        <w:t xml:space="preserve">Cadastrar ou editar (admin e Comercial)</w:t>
       </w:r>
       <w:r>
         <w:rPr>
@@ -862,7 +895,7 @@
         <w:rPr>
           <w:color w:val="1A1A1A"/>
         </w:rPr>
-        <w:t xml:space="preserve">: onde se criam os logins. Para um gestor, escolha o papel "Gestor de Tráfego", </w:t>
+        <w:t xml:space="preserve">: onde se criam os logins. Para um gestor individual (Estrategista de Atendimento, Planejamento, Copywriter, Apoio, Social Media ou Edição de Vídeos), escolha a função dele na lista, </w:t>
       </w:r>
       <w:r>
         <w:rPr>
@@ -876,7 +909,7 @@
         <w:rPr>
           <w:color w:val="1A1A1A"/>
         </w:rPr>
-        <w:t xml:space="preserve"> (define quais clientes ele enxerga) e, se for o caso, marque a função "Estrategista de Atendimento" pra liberar o acesso ao Faturamento. Para dar acesso ao time comercial, escolha o papel "🧑‍💼 Comercial" — não precisa vincular a nenhum membro da equipe, já que ele vê a carteira inteira. Para trocar uma senha, edite o usuário e digite a nova senha (deixe em branco para manter a atual). Você não consegue excluir a própria conta.</w:t>
+        <w:t xml:space="preserve"> (define quais clientes ele enxerga) e, se for o caso, marque a função "Estrategista de Atendimento" pra liberar o acesso ao Faturamento. Para dar acesso ao time comercial, escolha o papel "🧑‍💼 Comercial" — não precisa vincular a nenhum membro da equipe, já que ele vê a carteira inteira. Para dar acesso ao Gestor de Tráfego de carteira inteira (só edita o Acesso de Tráfego), escolha "🚦 Gestor de Tráfego" — também sem vínculo com membro da equipe; não confunda com um gestor individual comum, é um acesso diferente. Para trocar uma senha, edite o usuário e digite a nova senha (deixe em branco para manter a atual). Você não consegue excluir a própria conta.</w:t>
       </w:r>
     </w:p>
     <w:p>
@@ -1443,6 +1476,60 @@
           <w:color w:val="1A1A1A"/>
         </w:rPr>
         <w:t xml:space="preserve">: agora dá pra dar acesso ao time comercial pra cadastrar cliente novo direto no sistema, sem precisar do administrador. Comercial vê a carteira inteira e pode cadastrar e editar clientes, mas não exclui nenhum e não tem acesso a equipe, contas de acesso, faturamento ou relatórios — isso continua só com o administrador.</w:t>
+      </w:r>
+    </w:p>
+    <w:p>
+      <w:pPr>
+        <w:pStyle w:val="Heading1"/>
+        <w:spacing w:after="160" w:before="340"/>
+      </w:pPr>
+      <w:r>
+        <w:rPr>
+          <w:b/>
+          <w:bCs/>
+          <w:color w:val="C4973B"/>
+          <w:sz w:val="28"/>
+          <w:szCs w:val="28"/>
+        </w:rPr>
+        <w:t xml:space="preserve">Novidades da versão 7</w:t>
+      </w:r>
+    </w:p>
+    <w:p>
+      <w:pPr>
+        <w:spacing w:after="180"/>
+      </w:pPr>
+      <w:r>
+        <w:rPr>
+          <w:b/>
+          <w:bCs/>
+          <w:color w:val="1A1A1A"/>
+        </w:rPr>
+        <w:t xml:space="preserve">Novo papel: 🚦 Gestor de Tráfego (carteira inteira)</w:t>
+      </w:r>
+      <w:r>
+        <w:rPr>
+          <w:color w:val="1A1A1A"/>
+        </w:rPr>
+        <w:t xml:space="preserve">: vê a carteira inteira, mas só mexe no campo Acesso de Tráfego de cada cliente — não cadastra, não edita mais nada no cadastro e não exclui. Ideal pra quem cuida da liberação de acesso às contas de anúncio sem precisar dar acesso total de admin. Atenção: tem nome parecido com o acesso de "Gestor de Tráfego" individual (que só vê os próprios clientes) — são dois papéis diferentes, com finalidades diferentes.</w:t>
+      </w:r>
+    </w:p>
+    <w:p>
+      <w:pPr>
+        <w:spacing w:after="180"/>
+      </w:pPr>
+      <w:r>
+        <w:rPr>
+          <w:b/>
+          <w:bCs/>
+          <w:color w:val="1A1A1A"/>
+        </w:rPr>
+        <w:t xml:space="preserve">Novo alerta no Dashboard: 🔒 Sem acesso de tráfego</w:t>
+      </w:r>
+      <w:r>
+        <w:rPr>
+          <w:color w:val="1A1A1A"/>
+        </w:rPr>
+        <w:t xml:space="preserve">: mostra de cara quais clientes estão com o Acesso de Tráfego marcado como "Não", pra facilitar o acompanhamento (principalmente de quem tem o acesso de Gestor de Tráfego de carteira inteira).</w:t>
       </w:r>
     </w:p>
     <w:sectPr>

</xml_diff>

<commit_message>
Webhook n8n, alertas clicaveis no dashboard e gestor edita responsaveis
</commit_message>
<xml_diff>
--- a/docs/Manual-do-Usuario.docx
+++ b/docs/Manual-do-Usuario.docx
@@ -205,7 +205,7 @@
         <w:rPr>
           <w:color w:val="1A1A1A"/>
         </w:rPr>
-        <w:t xml:space="preserve"> vê apenas os clientes em que aparece como responsável em alguma função. A visão é de consulta: se algum dado estiver errado, avise o administrador para corrigir.</w:t>
+        <w:t xml:space="preserve"> vê apenas os clientes em que aparece como responsável em alguma função. Pode preencher e corrigir os responsáveis por função desses próprios clientes (útil pra resolver uma pendência direto pelo alerta do Dashboard) — o resto do cadastro (nome, marca, status, datas, acesso de tráfego etc.) fica travado na tela, só o administrador ou o comercial mexem nisso.</w:t>
       </w:r>
     </w:p>
     <w:p>
@@ -365,6 +365,25 @@
     </w:p>
     <w:p>
       <w:pPr>
+        <w:spacing w:after="180"/>
+      </w:pPr>
+      <w:r>
+        <w:rPr>
+          <w:b/>
+          <w:bCs/>
+          <w:color w:val="1A1A1A"/>
+        </w:rPr>
+        <w:t xml:space="preserve">Clique pra resolver na hora</w:t>
+      </w:r>
+      <w:r>
+        <w:rPr>
+          <w:color w:val="1A1A1A"/>
+        </w:rPr>
+        <w:t xml:space="preserve">: os itens de Pendências e Sem acesso de tráfego são clicáveis — clicar num deles abre direto o cadastro daquele cliente, já pronto pra você corrigir o que falta (sem precisar ir em Clientes e procurar manualmente). Cada um só consegue mexer no que sua conta permite: quem tem acesso de Gestor de Tráfego mexe no Acesso de Tráfego, e o estrategista (Gestor individual) preenche os responsáveis por função dos próprios clientes.</w:t>
+      </w:r>
+    </w:p>
+    <w:p>
+      <w:pPr>
         <w:pStyle w:val="Heading1"/>
         <w:spacing w:after="160" w:before="340"/>
       </w:pPr>
@@ -1530,6 +1549,60 @@
           <w:color w:val="1A1A1A"/>
         </w:rPr>
         <w:t xml:space="preserve">: mostra de cara quais clientes estão com o Acesso de Tráfego marcado como "Não", pra facilitar o acompanhamento (principalmente de quem tem o acesso de Gestor de Tráfego de carteira inteira).</w:t>
+      </w:r>
+    </w:p>
+    <w:p>
+      <w:pPr>
+        <w:pStyle w:val="Heading1"/>
+        <w:spacing w:after="160" w:before="340"/>
+      </w:pPr>
+      <w:r>
+        <w:rPr>
+          <w:b/>
+          <w:bCs/>
+          <w:color w:val="C4973B"/>
+          <w:sz w:val="28"/>
+          <w:szCs w:val="28"/>
+        </w:rPr>
+        <w:t xml:space="preserve">Novidades da versão 8</w:t>
+      </w:r>
+    </w:p>
+    <w:p>
+      <w:pPr>
+        <w:spacing w:after="180"/>
+      </w:pPr>
+      <w:r>
+        <w:rPr>
+          <w:b/>
+          <w:bCs/>
+          <w:color w:val="1A1A1A"/>
+        </w:rPr>
+        <w:t xml:space="preserve">Alertas clicáveis no Dashboard</w:t>
+      </w:r>
+      <w:r>
+        <w:rPr>
+          <w:color w:val="1A1A1A"/>
+        </w:rPr>
+        <w:t xml:space="preserve">: os itens de Pendências e Sem acesso de tráfego agora levam direto pro cadastro do cliente ao clicar — resolve na hora, sem precisar ir em Clientes e procurar.</w:t>
+      </w:r>
+    </w:p>
+    <w:p>
+      <w:pPr>
+        <w:spacing w:after="180"/>
+      </w:pPr>
+      <w:r>
+        <w:rPr>
+          <w:b/>
+          <w:bCs/>
+          <w:color w:val="1A1A1A"/>
+        </w:rPr>
+        <w:t xml:space="preserve">Gestor individual agora edita responsáveis</w:t>
+      </w:r>
+      <w:r>
+        <w:rPr>
+          <w:color w:val="1A1A1A"/>
+        </w:rPr>
+        <w:t xml:space="preserve">: quem tem o acesso de Gestor de Tráfego individual (estrategista) pode entrar no cadastro dos próprios clientes e preencher/corrigir os responsáveis por função — antes só dava pra visualizar. O resto do cadastro continua travado pra esse acesso.</w:t>
       </w:r>
     </w:p>
     <w:sectPr>

</xml_diff>